<commit_message>
feat: SG contract header (name+address), password policy, PDPA audit sign-off
#1 SG Local Secondment: the letter header placeholders "Full Name" / "Address" are now
   tokenised to {name} / {address}, so the header shows the employee's full name + address
   (full name per NRIC/IC, matching the salutation). Verified by render + integration test.
#10 Password policy: Supabase set to min 8 chars + lower/upper/digit; temp-password generator
   and the reset page client-check updated to match.
#13 Added docs/pdpa-audit.md — formal PDPA compliance audit & sign-off (5 invariants verified,
   data-flow + processor analysis, residual risks, owner sign-off line).

(#12 stale admin-credentials secret removed locally — password was reset by owner.)

Co-Authored-By: Claude Opus 4.8 (1M context) <noreply@anthropic.com>
</commit_message>
<xml_diff>
--- a/public/templates/sg-local-secondment.tokenised.docx
+++ b/public/templates/sg-local-secondment.tokenised.docx
@@ -148,7 +148,7 @@
           <w:sz w:val="22"/>
           <w:szCs w:val="22"/>
         </w:rPr>
-        <w:t>Full Name</w:t>
+        <w:t>{name}</w:t>
       </w:r>
     </w:p>
     <w:p>
@@ -166,7 +166,7 @@
           <w:sz w:val="22"/>
           <w:szCs w:val="22"/>
         </w:rPr>
-        <w:t>Address</w:t>
+        <w:t>{address}</w:t>
       </w:r>
     </w:p>
     <w:p>

</xml_diff>